<commit_message>
A word dictation fixed.
</commit_message>
<xml_diff>
--- a/fractal-literacy-english.docx
+++ b/fractal-literacy-english.docx
@@ -37,7 +37,19 @@
         <w:rPr>
           <w:rFonts w:ascii="Calibri" w:eastAsia="Calibri" w:hAnsi="Calibri" w:cs="Calibri"/>
         </w:rPr>
-        <w:t xml:space="preserve"> Dariush Alipour</w:t>
+        <w:t xml:space="preserve"> Dar</w:t>
+      </w:r>
+      <w:r>
+        <w:rPr>
+          <w:rFonts w:ascii="Calibri" w:eastAsia="Calibri" w:hAnsi="Calibri" w:cs="Calibri"/>
+        </w:rPr>
+        <w:t>yo</w:t>
+      </w:r>
+      <w:r>
+        <w:rPr>
+          <w:rFonts w:ascii="Calibri" w:eastAsia="Calibri" w:hAnsi="Calibri" w:cs="Calibri"/>
+        </w:rPr>
+        <w:t>ush Alipour</w:t>
       </w:r>
     </w:p>
     <w:p>
@@ -1753,6 +1765,7 @@
   <w:style w:type="character" w:default="1" w:styleId="DefaultParagraphFont">
     <w:name w:val="Default Paragraph Font"/>
     <w:uiPriority w:val="1"/>
+    <w:semiHidden/>
     <w:unhideWhenUsed/>
   </w:style>
   <w:style w:type="table" w:default="1" w:styleId="TableNormal">

</xml_diff>